<commit_message>
Tarea U2_P1 con datos de INEGI: rehecha con la plantilla de la profesora
Libro de Excel que completa la plantilla (0 a 100 años, fórmulas vivas, México 2019,
ambos sexos) y hojas con los datos usados; carpeta bases_de_datos_INEGI con las bases
originales (EDR, ENR y Censo 2020, zips fuera de git); gráficos, análisis en Word y
scripts verificados contra un cálculo independiente.

Co-Authored-By: Claude Sonnet 5.5 <noreply@anthropic.com>
Claude-Session: https://claude.ai/code/session_01MuUPaVKo13t4xGgqvC4yHk
</commit_message>
<xml_diff>
--- a/tarea_inegi/resultados/Analisis_Tabla_Mortalidad_INEGI_2019.docx
+++ b/tarea_inegi/resultados/Analisis_Tabla_Mortalidad_INEGI_2019.docx
@@ -32,7 +32,7 @@
           <w:sz w:val="21"/>
           <w:szCs w:val="21"/>
         </w:rPr>
-        <w:t xml:space="preserve">U2_P1 · Tabla de mortalidad INEGI. Cálculo con cifras de defunciones y nacimientos de INEGI.</w:t>
+        <w:t xml:space="preserve">U2_P1 · Tabla de mortalidad INEGI. Ambos sexos, con cifras de defunciones y nacimientos de INEGI.</w:t>
       </w:r>
     </w:p>
     <w:p>
@@ -62,7 +62,7 @@
           <w:sz w:val="21"/>
           <w:szCs w:val="21"/>
         </w:rPr>
-        <w:t xml:space="preserve">La tabla se calculó con datos abiertos de INEGI. El año de referencia es 2019, el último año completo antes de la pandemia de COVID-19, que elevó mucho la mortalidad en 2020 y 2021.</w:t>
+        <w:t xml:space="preserve">La tabla se calculó con bases de datos abiertas de INEGI, guardadas sin modificar en la carpeta bases_de_datos_INEGI/. El año de referencia es 2019, el último año completo antes de la pandemia de COVID-19, que elevó mucho la mortalidad en 2020 y 2021.</w:t>
       </w:r>
     </w:p>
     <w:p>
@@ -72,7 +72,7 @@
           <w:ilvl w:val="0"/>
           <w:numId w:val="2"/>
         </w:numPr>
-        <w:spacing w:after="50" w:line="264"/>
+        <w:spacing w:after="60" w:line="264"/>
       </w:pPr>
       <w:r>
         <w:rPr>
@@ -90,7 +90,7 @@
           <w:sz w:val="21"/>
           <w:szCs w:val="21"/>
         </w:rPr>
-        <w:t xml:space="preserve">Estadísticas de Defunciones Registradas (EDR), conjuntos de datos abiertos 2019, 2020 y 2021. Se cuentan las defunciones ocurridas en 2019 (las registradas ese año y las registradas tarde en 2020 y 2021): 744,479, con la edad al morir.</w:t>
+        <w:t xml:space="preserve">Estadísticas de Defunciones Registradas (EDR), datos abiertos 2019, 2020 y 2021. Se cuentan las defunciones ocurridas en 2019 (registradas ese año o después): 729,057 + 14,425 + 997 = 744,479.</w:t>
       </w:r>
     </w:p>
     <w:p>
@@ -100,7 +100,7 @@
           <w:ilvl w:val="0"/>
           <w:numId w:val="2"/>
         </w:numPr>
-        <w:spacing w:after="50" w:line="264"/>
+        <w:spacing w:after="60" w:line="264"/>
       </w:pPr>
       <w:r>
         <w:rPr>
@@ -118,7 +118,7 @@
           <w:sz w:val="21"/>
           <w:szCs w:val="21"/>
         </w:rPr>
-        <w:t xml:space="preserve">Estadística de Nacimientos Registrados, datos abiertos 2019, 2020 y 2021. Nacimientos ocurridos en 2019: 1,844,913.</w:t>
+        <w:t xml:space="preserve">Estadística de Nacimientos Registrados (ENR), datos abiertos 2019, 2020 y 2021. Nacimientos ocurridos en 2019: 1,432,072 + 335,378 + 77,463 = 1,844,913. Se usan los tres años porque muchos nacimientos se registran con retraso.</w:t>
       </w:r>
     </w:p>
     <w:p>
@@ -128,7 +128,7 @@
           <w:ilvl w:val="0"/>
           <w:numId w:val="2"/>
         </w:numPr>
-        <w:spacing w:after="50" w:line="264"/>
+        <w:spacing w:after="60" w:line="264"/>
       </w:pPr>
       <w:r>
         <w:rPr>
@@ -146,7 +146,7 @@
           <w:sz w:val="21"/>
           <w:szCs w:val="21"/>
         </w:rPr>
-        <w:t xml:space="preserve">Censo de Población y Vivienda 2020, tabulado de población por edad desplegada y sexo (INEGI). Es el denominador de qx a partir del año de edad.</w:t>
+        <w:t xml:space="preserve">Censo de Población y Vivienda 2020 (INEGI), población por edad simple. Es el denominador de qx a partir del año de edad, porque con solo nacimientos y defunciones no se puede calcular el riesgo de morir de las demás edades.</w:t>
       </w:r>
     </w:p>
     <w:p>
@@ -176,7 +176,7 @@
           <w:sz w:val="21"/>
           <w:szCs w:val="21"/>
         </w:rPr>
-        <w:t xml:space="preserve">La tabla es de periodo (generación ficticia): se aplica a 100,000 recién nacidos la mortalidad por edad observada en 2019. Se sigue el formato de la plantilla de clase: x, qx, lx, dx, Lx, Tx y ex.</w:t>
+        <w:t xml:space="preserve">La tabla es de periodo (generación ficticia): se aplica a 100,000 recién nacidos la mortalidad por edad observada en 2019. Sigue el formato de la plantilla de clase: x, qx, lx, dx, Lx, Tx y ex.</w:t>
       </w:r>
     </w:p>
     <w:p>
@@ -232,7 +232,7 @@
           <w:sz w:val="20"/>
           <w:szCs w:val="20"/>
         </w:rPr>
-        <w:t xml:space="preserve">l0 = 100,000;   l(x+1) = lx − dx;   dx = lx · qx</w:t>
+        <w:t xml:space="preserve">l0 = 100,000;   dx = lx · qx;   l(x+1) = lx − dx</w:t>
       </w:r>
     </w:p>
     <w:p>
@@ -259,7 +259,7 @@
           <w:sz w:val="21"/>
           <w:szCs w:val="21"/>
         </w:rPr>
-        <w:t xml:space="preserve">Dos ajustes de los datos, ambos con interruptor o a la vista en el Excel: (a) las defunciones con edad no especificada (0.5 %) se reparten entre las edades en proporción; (b) el Censo concentra población en edades redondas (a los 30 años hay 2.37 millones de personas y a los 31 solo 1.54 millones), lo que haría zigzaguear qx, así que de 10 a 97 años se usó una media móvil de 5 edades en defunciones y población. El suavizado cambia e0 solo 0.3 años.</w:t>
+        <w:t xml:space="preserve">Dos ajustes a los datos, visibles en el Excel: (a) las defunciones con edad no especificada (0.5 %) se reparten entre las edades en proporción; (b) el Censo concentra población en edades redondas (a los 30 años hay 2.37 millones de personas y a los 31 solo 1.54 millones), lo que haría zigzaguear qx, así que de 10 a 97 años se usa una media móvil de 5 edades en defunciones y población (interruptor en la hoja de la tabla). El suavizado cambia e0 en 0.3 años. Como en la plantilla, dx y Lx se redondean a enteros.</w:t>
       </w:r>
     </w:p>
     <w:p>
@@ -289,7 +289,7 @@
           <w:sz w:val="21"/>
           <w:szCs w:val="21"/>
         </w:rPr>
-        <w:t xml:space="preserve">La esperanza de vida al nacer es de 76.0 años (hombres 72.9; mujeres 79.1). La mortalidad infantil es de 12.4 por mil nacimientos. De cada 100,000 nacidos, 79,416 llegan a los 65 años y 51,635 a los 80.</w:t>
+        <w:t xml:space="preserve">La esperanza de vida al nacer es de 76.0 años (hombres 72.9; mujeres 79.1) y a los 65 años les quedan 18.7 años más. La mortalidad infantil es de 12.4 por mil. De cada 100,000 nacidos, 79,415 llegan a los 65 años y 51,635 a los 80.</w:t>
       </w:r>
     </w:p>
     <w:tbl>
@@ -305,10 +305,8 @@
         </w:tblBorders>
       </w:tblPr>
       <w:tblGrid>
-        <w:gridCol w:w="4200"/>
-        <w:gridCol w:w="1720"/>
-        <w:gridCol w:w="1720"/>
-        <w:gridCol w:w="1720"/>
+        <w:gridCol w:w="6360"/>
+        <w:gridCol w:w="3000"/>
       </w:tblGrid>
       <w:tr>
         <w:trPr>
@@ -316,7 +314,7 @@
         </w:trPr>
         <w:tc>
           <w:tcPr>
-            <w:tcW w:type="dxa" w:w="4200"/>
+            <w:tcW w:type="dxa" w:w="6360"/>
             <w:tcBorders>
               <w:top w:val="single" w:color="BFBFBF" w:sz="4"/>
               <w:left w:val="single" w:color="BFBFBF" w:sz="4"/>
@@ -350,7 +348,7 @@
         </w:tc>
         <w:tc>
           <w:tcPr>
-            <w:tcW w:type="dxa" w:w="1720"/>
+            <w:tcW w:type="dxa" w:w="3000"/>
             <w:tcBorders>
               <w:top w:val="single" w:color="BFBFBF" w:sz="4"/>
               <w:left w:val="single" w:color="BFBFBF" w:sz="4"/>
@@ -378,31 +376,32 @@
                 <w:sz w:val="18"/>
                 <w:szCs w:val="18"/>
               </w:rPr>
-              <w:t xml:space="preserve">Hombres</w:t>
-            </w:r>
-          </w:p>
-        </w:tc>
-        <w:tc>
-          <w:tcPr>
-            <w:tcW w:type="dxa" w:w="1720"/>
-            <w:tcBorders>
-              <w:top w:val="single" w:color="BFBFBF" w:sz="4"/>
-              <w:left w:val="single" w:color="BFBFBF" w:sz="4"/>
-              <w:bottom w:val="single" w:color="BFBFBF" w:sz="4"/>
-              <w:right w:val="single" w:color="BFBFBF" w:sz="4"/>
-            </w:tcBorders>
-            <w:shd w:fill="DCE3F0" w:color="auto" w:val="clear"/>
-            <w:tcMar>
-              <w:top w:type="dxa" w:w="45"/>
-              <w:left w:type="dxa" w:w="80"/>
-              <w:bottom w:type="dxa" w:w="45"/>
-              <w:right w:type="dxa" w:w="80"/>
-            </w:tcMar>
-          </w:tcPr>
-          <w:p>
-            <w:pPr>
-              <w:keepNext/>
-              <w:jc w:val="center"/>
+              <w:t xml:space="preserve">Valor</w:t>
+            </w:r>
+          </w:p>
+        </w:tc>
+      </w:tr>
+      <w:tr>
+        <w:tc>
+          <w:tcPr>
+            <w:tcW w:type="dxa" w:w="6360"/>
+            <w:tcBorders>
+              <w:top w:val="single" w:color="BFBFBF" w:sz="4"/>
+              <w:left w:val="single" w:color="BFBFBF" w:sz="4"/>
+              <w:bottom w:val="single" w:color="BFBFBF" w:sz="4"/>
+              <w:right w:val="single" w:color="BFBFBF" w:sz="4"/>
+            </w:tcBorders>
+            <w:tcMar>
+              <w:top w:type="dxa" w:w="45"/>
+              <w:left w:type="dxa" w:w="80"/>
+              <w:bottom w:type="dxa" w:w="45"/>
+              <w:right w:type="dxa" w:w="80"/>
+            </w:tcMar>
+          </w:tcPr>
+          <w:p>
+            <w:pPr>
+              <w:keepNext/>
+              <w:jc w:val="left"/>
             </w:pPr>
             <w:r>
               <w:rPr>
@@ -412,31 +411,65 @@
                 <w:sz w:val="18"/>
                 <w:szCs w:val="18"/>
               </w:rPr>
-              <w:t xml:space="preserve">Mujeres</w:t>
-            </w:r>
-          </w:p>
-        </w:tc>
-        <w:tc>
-          <w:tcPr>
-            <w:tcW w:type="dxa" w:w="1720"/>
-            <w:tcBorders>
-              <w:top w:val="single" w:color="BFBFBF" w:sz="4"/>
-              <w:left w:val="single" w:color="BFBFBF" w:sz="4"/>
-              <w:bottom w:val="single" w:color="BFBFBF" w:sz="4"/>
-              <w:right w:val="single" w:color="BFBFBF" w:sz="4"/>
-            </w:tcBorders>
-            <w:shd w:fill="DCE3F0" w:color="auto" w:val="clear"/>
-            <w:tcMar>
-              <w:top w:type="dxa" w:w="45"/>
-              <w:left w:type="dxa" w:w="80"/>
-              <w:bottom w:type="dxa" w:w="45"/>
-              <w:right w:type="dxa" w:w="80"/>
-            </w:tcMar>
-          </w:tcPr>
-          <w:p>
-            <w:pPr>
-              <w:keepNext/>
-              <w:jc w:val="center"/>
+              <w:t xml:space="preserve">e0: esperanza de vida al nacer (años)</w:t>
+            </w:r>
+          </w:p>
+        </w:tc>
+        <w:tc>
+          <w:tcPr>
+            <w:tcW w:type="dxa" w:w="3000"/>
+            <w:tcBorders>
+              <w:top w:val="single" w:color="BFBFBF" w:sz="4"/>
+              <w:left w:val="single" w:color="BFBFBF" w:sz="4"/>
+              <w:bottom w:val="single" w:color="BFBFBF" w:sz="4"/>
+              <w:right w:val="single" w:color="BFBFBF" w:sz="4"/>
+            </w:tcBorders>
+            <w:tcMar>
+              <w:top w:type="dxa" w:w="45"/>
+              <w:left w:type="dxa" w:w="80"/>
+              <w:bottom w:type="dxa" w:w="45"/>
+              <w:right w:type="dxa" w:w="80"/>
+            </w:tcMar>
+          </w:tcPr>
+          <w:p>
+            <w:pPr>
+              <w:keepNext/>
+              <w:jc w:val="center"/>
+            </w:pPr>
+            <w:r>
+              <w:rPr>
+                <w:rFonts w:ascii="Arial" w:cs="Arial" w:eastAsia="Arial" w:hAnsi="Arial"/>
+                <w:b w:val="false"/>
+                <w:bCs w:val="false"/>
+                <w:sz w:val="18"/>
+                <w:szCs w:val="18"/>
+              </w:rPr>
+              <w:t xml:space="preserve">75.99</w:t>
+            </w:r>
+          </w:p>
+        </w:tc>
+      </w:tr>
+      <w:tr>
+        <w:tc>
+          <w:tcPr>
+            <w:tcW w:type="dxa" w:w="6360"/>
+            <w:tcBorders>
+              <w:top w:val="single" w:color="BFBFBF" w:sz="4"/>
+              <w:left w:val="single" w:color="BFBFBF" w:sz="4"/>
+              <w:bottom w:val="single" w:color="BFBFBF" w:sz="4"/>
+              <w:right w:val="single" w:color="BFBFBF" w:sz="4"/>
+            </w:tcBorders>
+            <w:tcMar>
+              <w:top w:type="dxa" w:w="45"/>
+              <w:left w:type="dxa" w:w="80"/>
+              <w:bottom w:type="dxa" w:w="45"/>
+              <w:right w:type="dxa" w:w="80"/>
+            </w:tcMar>
+          </w:tcPr>
+          <w:p>
+            <w:pPr>
+              <w:keepNext/>
+              <w:jc w:val="left"/>
             </w:pPr>
             <w:r>
               <w:rPr>
@@ -446,7 +479,40 @@
                 <w:sz w:val="18"/>
                 <w:szCs w:val="18"/>
               </w:rPr>
-              <w:t xml:space="preserve">Ambos sexos</w:t>
+              <w:t xml:space="preserve">e1: esperanza de vida a 1 año (años)</w:t>
+            </w:r>
+          </w:p>
+        </w:tc>
+        <w:tc>
+          <w:tcPr>
+            <w:tcW w:type="dxa" w:w="3000"/>
+            <w:tcBorders>
+              <w:top w:val="single" w:color="BFBFBF" w:sz="4"/>
+              <w:left w:val="single" w:color="BFBFBF" w:sz="4"/>
+              <w:bottom w:val="single" w:color="BFBFBF" w:sz="4"/>
+              <w:right w:val="single" w:color="BFBFBF" w:sz="4"/>
+            </w:tcBorders>
+            <w:tcMar>
+              <w:top w:type="dxa" w:w="45"/>
+              <w:left w:type="dxa" w:w="80"/>
+              <w:bottom w:type="dxa" w:w="45"/>
+              <w:right w:type="dxa" w:w="80"/>
+            </w:tcMar>
+          </w:tcPr>
+          <w:p>
+            <w:pPr>
+              <w:keepNext/>
+              <w:jc w:val="center"/>
+            </w:pPr>
+            <w:r>
+              <w:rPr>
+                <w:rFonts w:ascii="Arial" w:cs="Arial" w:eastAsia="Arial" w:hAnsi="Arial"/>
+                <w:b w:val="false"/>
+                <w:bCs w:val="false"/>
+                <w:sz w:val="18"/>
+                <w:szCs w:val="18"/>
+              </w:rPr>
+              <w:t xml:space="preserve">75.94</w:t>
             </w:r>
           </w:p>
         </w:tc>
@@ -454,7 +520,7 @@
       <w:tr>
         <w:tc>
           <w:tcPr>
-            <w:tcW w:type="dxa" w:w="4200"/>
+            <w:tcW w:type="dxa" w:w="6360"/>
             <w:tcBorders>
               <w:top w:val="single" w:color="BFBFBF" w:sz="4"/>
               <w:left w:val="single" w:color="BFBFBF" w:sz="4"/>
@@ -481,106 +547,40 @@
                 <w:sz w:val="18"/>
                 <w:szCs w:val="18"/>
               </w:rPr>
-              <w:t xml:space="preserve">e0: esperanza de vida al nacer (años)</w:t>
-            </w:r>
-          </w:p>
-        </w:tc>
-        <w:tc>
-          <w:tcPr>
-            <w:tcW w:type="dxa" w:w="1720"/>
-            <w:tcBorders>
-              <w:top w:val="single" w:color="BFBFBF" w:sz="4"/>
-              <w:left w:val="single" w:color="BFBFBF" w:sz="4"/>
-              <w:bottom w:val="single" w:color="BFBFBF" w:sz="4"/>
-              <w:right w:val="single" w:color="BFBFBF" w:sz="4"/>
-            </w:tcBorders>
-            <w:tcMar>
-              <w:top w:type="dxa" w:w="45"/>
-              <w:left w:type="dxa" w:w="80"/>
-              <w:bottom w:type="dxa" w:w="45"/>
-              <w:right w:type="dxa" w:w="80"/>
-            </w:tcMar>
-          </w:tcPr>
-          <w:p>
-            <w:pPr>
-              <w:keepNext/>
-              <w:jc w:val="center"/>
-            </w:pPr>
-            <w:r>
-              <w:rPr>
-                <w:rFonts w:ascii="Arial" w:cs="Arial" w:eastAsia="Arial" w:hAnsi="Arial"/>
-                <w:b w:val="false"/>
-                <w:bCs w:val="false"/>
-                <w:sz w:val="18"/>
-                <w:szCs w:val="18"/>
-              </w:rPr>
-              <w:t xml:space="preserve">72.90</w:t>
-            </w:r>
-          </w:p>
-        </w:tc>
-        <w:tc>
-          <w:tcPr>
-            <w:tcW w:type="dxa" w:w="1720"/>
-            <w:tcBorders>
-              <w:top w:val="single" w:color="BFBFBF" w:sz="4"/>
-              <w:left w:val="single" w:color="BFBFBF" w:sz="4"/>
-              <w:bottom w:val="single" w:color="BFBFBF" w:sz="4"/>
-              <w:right w:val="single" w:color="BFBFBF" w:sz="4"/>
-            </w:tcBorders>
-            <w:tcMar>
-              <w:top w:type="dxa" w:w="45"/>
-              <w:left w:type="dxa" w:w="80"/>
-              <w:bottom w:type="dxa" w:w="45"/>
-              <w:right w:type="dxa" w:w="80"/>
-            </w:tcMar>
-          </w:tcPr>
-          <w:p>
-            <w:pPr>
-              <w:keepNext/>
-              <w:jc w:val="center"/>
-            </w:pPr>
-            <w:r>
-              <w:rPr>
-                <w:rFonts w:ascii="Arial" w:cs="Arial" w:eastAsia="Arial" w:hAnsi="Arial"/>
-                <w:b w:val="false"/>
-                <w:bCs w:val="false"/>
-                <w:sz w:val="18"/>
-                <w:szCs w:val="18"/>
-              </w:rPr>
-              <w:t xml:space="preserve">79.11</w:t>
-            </w:r>
-          </w:p>
-        </w:tc>
-        <w:tc>
-          <w:tcPr>
-            <w:tcW w:type="dxa" w:w="1720"/>
-            <w:tcBorders>
-              <w:top w:val="single" w:color="BFBFBF" w:sz="4"/>
-              <w:left w:val="single" w:color="BFBFBF" w:sz="4"/>
-              <w:bottom w:val="single" w:color="BFBFBF" w:sz="4"/>
-              <w:right w:val="single" w:color="BFBFBF" w:sz="4"/>
-            </w:tcBorders>
-            <w:tcMar>
-              <w:top w:type="dxa" w:w="45"/>
-              <w:left w:type="dxa" w:w="80"/>
-              <w:bottom w:type="dxa" w:w="45"/>
-              <w:right w:type="dxa" w:w="80"/>
-            </w:tcMar>
-          </w:tcPr>
-          <w:p>
-            <w:pPr>
-              <w:keepNext/>
-              <w:jc w:val="center"/>
-            </w:pPr>
-            <w:r>
-              <w:rPr>
-                <w:rFonts w:ascii="Arial" w:cs="Arial" w:eastAsia="Arial" w:hAnsi="Arial"/>
-                <w:b w:val="false"/>
-                <w:bCs w:val="false"/>
-                <w:sz w:val="18"/>
-                <w:szCs w:val="18"/>
-              </w:rPr>
-              <w:t xml:space="preserve">75.99</w:t>
+              <w:t xml:space="preserve">e65: esperanza de vida a los 65 años (años)</w:t>
+            </w:r>
+          </w:p>
+        </w:tc>
+        <w:tc>
+          <w:tcPr>
+            <w:tcW w:type="dxa" w:w="3000"/>
+            <w:tcBorders>
+              <w:top w:val="single" w:color="BFBFBF" w:sz="4"/>
+              <w:left w:val="single" w:color="BFBFBF" w:sz="4"/>
+              <w:bottom w:val="single" w:color="BFBFBF" w:sz="4"/>
+              <w:right w:val="single" w:color="BFBFBF" w:sz="4"/>
+            </w:tcBorders>
+            <w:tcMar>
+              <w:top w:type="dxa" w:w="45"/>
+              <w:left w:type="dxa" w:w="80"/>
+              <w:bottom w:type="dxa" w:w="45"/>
+              <w:right w:type="dxa" w:w="80"/>
+            </w:tcMar>
+          </w:tcPr>
+          <w:p>
+            <w:pPr>
+              <w:keepNext/>
+              <w:jc w:val="center"/>
+            </w:pPr>
+            <w:r>
+              <w:rPr>
+                <w:rFonts w:ascii="Arial" w:cs="Arial" w:eastAsia="Arial" w:hAnsi="Arial"/>
+                <w:b w:val="false"/>
+                <w:bCs w:val="false"/>
+                <w:sz w:val="18"/>
+                <w:szCs w:val="18"/>
+              </w:rPr>
+              <w:t xml:space="preserve">18.74</w:t>
             </w:r>
           </w:p>
         </w:tc>
@@ -588,7 +588,7 @@
       <w:tr>
         <w:tc>
           <w:tcPr>
-            <w:tcW w:type="dxa" w:w="4200"/>
+            <w:tcW w:type="dxa" w:w="6360"/>
             <w:tcBorders>
               <w:top w:val="single" w:color="BFBFBF" w:sz="4"/>
               <w:left w:val="single" w:color="BFBFBF" w:sz="4"/>
@@ -615,106 +615,40 @@
                 <w:sz w:val="18"/>
                 <w:szCs w:val="18"/>
               </w:rPr>
-              <w:t xml:space="preserve">e65: esperanza de vida a los 65 años</w:t>
-            </w:r>
-          </w:p>
-        </w:tc>
-        <w:tc>
-          <w:tcPr>
-            <w:tcW w:type="dxa" w:w="1720"/>
-            <w:tcBorders>
-              <w:top w:val="single" w:color="BFBFBF" w:sz="4"/>
-              <w:left w:val="single" w:color="BFBFBF" w:sz="4"/>
-              <w:bottom w:val="single" w:color="BFBFBF" w:sz="4"/>
-              <w:right w:val="single" w:color="BFBFBF" w:sz="4"/>
-            </w:tcBorders>
-            <w:tcMar>
-              <w:top w:type="dxa" w:w="45"/>
-              <w:left w:type="dxa" w:w="80"/>
-              <w:bottom w:type="dxa" w:w="45"/>
-              <w:right w:type="dxa" w:w="80"/>
-            </w:tcMar>
-          </w:tcPr>
-          <w:p>
-            <w:pPr>
-              <w:keepNext/>
-              <w:jc w:val="center"/>
-            </w:pPr>
-            <w:r>
-              <w:rPr>
-                <w:rFonts w:ascii="Arial" w:cs="Arial" w:eastAsia="Arial" w:hAnsi="Arial"/>
-                <w:b w:val="false"/>
-                <w:bCs w:val="false"/>
-                <w:sz w:val="18"/>
-                <w:szCs w:val="18"/>
-              </w:rPr>
-              <w:t xml:space="preserve">17.77</w:t>
-            </w:r>
-          </w:p>
-        </w:tc>
-        <w:tc>
-          <w:tcPr>
-            <w:tcW w:type="dxa" w:w="1720"/>
-            <w:tcBorders>
-              <w:top w:val="single" w:color="BFBFBF" w:sz="4"/>
-              <w:left w:val="single" w:color="BFBFBF" w:sz="4"/>
-              <w:bottom w:val="single" w:color="BFBFBF" w:sz="4"/>
-              <w:right w:val="single" w:color="BFBFBF" w:sz="4"/>
-            </w:tcBorders>
-            <w:tcMar>
-              <w:top w:type="dxa" w:w="45"/>
-              <w:left w:type="dxa" w:w="80"/>
-              <w:bottom w:type="dxa" w:w="45"/>
-              <w:right w:type="dxa" w:w="80"/>
-            </w:tcMar>
-          </w:tcPr>
-          <w:p>
-            <w:pPr>
-              <w:keepNext/>
-              <w:jc w:val="center"/>
-            </w:pPr>
-            <w:r>
-              <w:rPr>
-                <w:rFonts w:ascii="Arial" w:cs="Arial" w:eastAsia="Arial" w:hAnsi="Arial"/>
-                <w:b w:val="false"/>
-                <w:bCs w:val="false"/>
-                <w:sz w:val="18"/>
-                <w:szCs w:val="18"/>
-              </w:rPr>
-              <w:t xml:space="preserve">19.65</w:t>
-            </w:r>
-          </w:p>
-        </w:tc>
-        <w:tc>
-          <w:tcPr>
-            <w:tcW w:type="dxa" w:w="1720"/>
-            <w:tcBorders>
-              <w:top w:val="single" w:color="BFBFBF" w:sz="4"/>
-              <w:left w:val="single" w:color="BFBFBF" w:sz="4"/>
-              <w:bottom w:val="single" w:color="BFBFBF" w:sz="4"/>
-              <w:right w:val="single" w:color="BFBFBF" w:sz="4"/>
-            </w:tcBorders>
-            <w:tcMar>
-              <w:top w:type="dxa" w:w="45"/>
-              <w:left w:type="dxa" w:w="80"/>
-              <w:bottom w:type="dxa" w:w="45"/>
-              <w:right w:type="dxa" w:w="80"/>
-            </w:tcMar>
-          </w:tcPr>
-          <w:p>
-            <w:pPr>
-              <w:keepNext/>
-              <w:jc w:val="center"/>
-            </w:pPr>
-            <w:r>
-              <w:rPr>
-                <w:rFonts w:ascii="Arial" w:cs="Arial" w:eastAsia="Arial" w:hAnsi="Arial"/>
-                <w:b w:val="false"/>
-                <w:bCs w:val="false"/>
-                <w:sz w:val="18"/>
-                <w:szCs w:val="18"/>
-              </w:rPr>
-              <w:t xml:space="preserve">18.74</w:t>
+              <w:t xml:space="preserve">q(0): mortalidad infantil (por mil)</w:t>
+            </w:r>
+          </w:p>
+        </w:tc>
+        <w:tc>
+          <w:tcPr>
+            <w:tcW w:type="dxa" w:w="3000"/>
+            <w:tcBorders>
+              <w:top w:val="single" w:color="BFBFBF" w:sz="4"/>
+              <w:left w:val="single" w:color="BFBFBF" w:sz="4"/>
+              <w:bottom w:val="single" w:color="BFBFBF" w:sz="4"/>
+              <w:right w:val="single" w:color="BFBFBF" w:sz="4"/>
+            </w:tcBorders>
+            <w:tcMar>
+              <w:top w:type="dxa" w:w="45"/>
+              <w:left w:type="dxa" w:w="80"/>
+              <w:bottom w:type="dxa" w:w="45"/>
+              <w:right w:type="dxa" w:w="80"/>
+            </w:tcMar>
+          </w:tcPr>
+          <w:p>
+            <w:pPr>
+              <w:keepNext/>
+              <w:jc w:val="center"/>
+            </w:pPr>
+            <w:r>
+              <w:rPr>
+                <w:rFonts w:ascii="Arial" w:cs="Arial" w:eastAsia="Arial" w:hAnsi="Arial"/>
+                <w:b w:val="false"/>
+                <w:bCs w:val="false"/>
+                <w:sz w:val="18"/>
+                <w:szCs w:val="18"/>
+              </w:rPr>
+              <w:t xml:space="preserve">12.4</w:t>
             </w:r>
           </w:p>
         </w:tc>
@@ -722,7 +656,7 @@
       <w:tr>
         <w:tc>
           <w:tcPr>
-            <w:tcW w:type="dxa" w:w="4200"/>
+            <w:tcW w:type="dxa" w:w="6360"/>
             <w:tcBorders>
               <w:top w:val="single" w:color="BFBFBF" w:sz="4"/>
               <w:left w:val="single" w:color="BFBFBF" w:sz="4"/>
@@ -749,106 +683,40 @@
                 <w:sz w:val="18"/>
                 <w:szCs w:val="18"/>
               </w:rPr>
-              <w:t xml:space="preserve">q(0): mortalidad infantil (por mil)</w:t>
-            </w:r>
-          </w:p>
-        </w:tc>
-        <w:tc>
-          <w:tcPr>
-            <w:tcW w:type="dxa" w:w="1720"/>
-            <w:tcBorders>
-              <w:top w:val="single" w:color="BFBFBF" w:sz="4"/>
-              <w:left w:val="single" w:color="BFBFBF" w:sz="4"/>
-              <w:bottom w:val="single" w:color="BFBFBF" w:sz="4"/>
-              <w:right w:val="single" w:color="BFBFBF" w:sz="4"/>
-            </w:tcBorders>
-            <w:tcMar>
-              <w:top w:type="dxa" w:w="45"/>
-              <w:left w:type="dxa" w:w="80"/>
-              <w:bottom w:type="dxa" w:w="45"/>
-              <w:right w:type="dxa" w:w="80"/>
-            </w:tcMar>
-          </w:tcPr>
-          <w:p>
-            <w:pPr>
-              <w:keepNext/>
-              <w:jc w:val="center"/>
-            </w:pPr>
-            <w:r>
-              <w:rPr>
-                <w:rFonts w:ascii="Arial" w:cs="Arial" w:eastAsia="Arial" w:hAnsi="Arial"/>
-                <w:b w:val="false"/>
-                <w:bCs w:val="false"/>
-                <w:sz w:val="18"/>
-                <w:szCs w:val="18"/>
-              </w:rPr>
-              <w:t xml:space="preserve">13.65</w:t>
-            </w:r>
-          </w:p>
-        </w:tc>
-        <w:tc>
-          <w:tcPr>
-            <w:tcW w:type="dxa" w:w="1720"/>
-            <w:tcBorders>
-              <w:top w:val="single" w:color="BFBFBF" w:sz="4"/>
-              <w:left w:val="single" w:color="BFBFBF" w:sz="4"/>
-              <w:bottom w:val="single" w:color="BFBFBF" w:sz="4"/>
-              <w:right w:val="single" w:color="BFBFBF" w:sz="4"/>
-            </w:tcBorders>
-            <w:tcMar>
-              <w:top w:type="dxa" w:w="45"/>
-              <w:left w:type="dxa" w:w="80"/>
-              <w:bottom w:type="dxa" w:w="45"/>
-              <w:right w:type="dxa" w:w="80"/>
-            </w:tcMar>
-          </w:tcPr>
-          <w:p>
-            <w:pPr>
-              <w:keepNext/>
-              <w:jc w:val="center"/>
-            </w:pPr>
-            <w:r>
-              <w:rPr>
-                <w:rFonts w:ascii="Arial" w:cs="Arial" w:eastAsia="Arial" w:hAnsi="Arial"/>
-                <w:b w:val="false"/>
-                <w:bCs w:val="false"/>
-                <w:sz w:val="18"/>
-                <w:szCs w:val="18"/>
-              </w:rPr>
-              <w:t xml:space="preserve">11.04</w:t>
-            </w:r>
-          </w:p>
-        </w:tc>
-        <w:tc>
-          <w:tcPr>
-            <w:tcW w:type="dxa" w:w="1720"/>
-            <w:tcBorders>
-              <w:top w:val="single" w:color="BFBFBF" w:sz="4"/>
-              <w:left w:val="single" w:color="BFBFBF" w:sz="4"/>
-              <w:bottom w:val="single" w:color="BFBFBF" w:sz="4"/>
-              <w:right w:val="single" w:color="BFBFBF" w:sz="4"/>
-            </w:tcBorders>
-            <w:tcMar>
-              <w:top w:type="dxa" w:w="45"/>
-              <w:left w:type="dxa" w:w="80"/>
-              <w:bottom w:type="dxa" w:w="45"/>
-              <w:right w:type="dxa" w:w="80"/>
-            </w:tcMar>
-          </w:tcPr>
-          <w:p>
-            <w:pPr>
-              <w:keepNext/>
-              <w:jc w:val="center"/>
-            </w:pPr>
-            <w:r>
-              <w:rPr>
-                <w:rFonts w:ascii="Arial" w:cs="Arial" w:eastAsia="Arial" w:hAnsi="Arial"/>
-                <w:b w:val="false"/>
-                <w:bCs w:val="false"/>
-                <w:sz w:val="18"/>
-                <w:szCs w:val="18"/>
-              </w:rPr>
-              <w:t xml:space="preserve">12.42</w:t>
+              <w:t xml:space="preserve">5q0: probabilidad de morir antes de los 5 años (por mil)</w:t>
+            </w:r>
+          </w:p>
+        </w:tc>
+        <w:tc>
+          <w:tcPr>
+            <w:tcW w:type="dxa" w:w="3000"/>
+            <w:tcBorders>
+              <w:top w:val="single" w:color="BFBFBF" w:sz="4"/>
+              <w:left w:val="single" w:color="BFBFBF" w:sz="4"/>
+              <w:bottom w:val="single" w:color="BFBFBF" w:sz="4"/>
+              <w:right w:val="single" w:color="BFBFBF" w:sz="4"/>
+            </w:tcBorders>
+            <w:tcMar>
+              <w:top w:type="dxa" w:w="45"/>
+              <w:left w:type="dxa" w:w="80"/>
+              <w:bottom w:type="dxa" w:w="45"/>
+              <w:right w:type="dxa" w:w="80"/>
+            </w:tcMar>
+          </w:tcPr>
+          <w:p>
+            <w:pPr>
+              <w:keepNext/>
+              <w:jc w:val="center"/>
+            </w:pPr>
+            <w:r>
+              <w:rPr>
+                <w:rFonts w:ascii="Arial" w:cs="Arial" w:eastAsia="Arial" w:hAnsi="Arial"/>
+                <w:b w:val="false"/>
+                <w:bCs w:val="false"/>
+                <w:sz w:val="18"/>
+                <w:szCs w:val="18"/>
+              </w:rPr>
+              <w:t xml:space="preserve">14.7</w:t>
             </w:r>
           </w:p>
         </w:tc>
@@ -856,7 +724,7 @@
       <w:tr>
         <w:tc>
           <w:tcPr>
-            <w:tcW w:type="dxa" w:w="4200"/>
+            <w:tcW w:type="dxa" w:w="6360"/>
             <w:tcBorders>
               <w:top w:val="single" w:color="BFBFBF" w:sz="4"/>
               <w:left w:val="single" w:color="BFBFBF" w:sz="4"/>
@@ -883,106 +751,40 @@
                 <w:sz w:val="18"/>
                 <w:szCs w:val="18"/>
               </w:rPr>
-              <w:t xml:space="preserve">5q0: morir antes de los 5 años (por mil)</w:t>
-            </w:r>
-          </w:p>
-        </w:tc>
-        <w:tc>
-          <w:tcPr>
-            <w:tcW w:type="dxa" w:w="1720"/>
-            <w:tcBorders>
-              <w:top w:val="single" w:color="BFBFBF" w:sz="4"/>
-              <w:left w:val="single" w:color="BFBFBF" w:sz="4"/>
-              <w:bottom w:val="single" w:color="BFBFBF" w:sz="4"/>
-              <w:right w:val="single" w:color="BFBFBF" w:sz="4"/>
-            </w:tcBorders>
-            <w:tcMar>
-              <w:top w:type="dxa" w:w="45"/>
-              <w:left w:type="dxa" w:w="80"/>
-              <w:bottom w:type="dxa" w:w="45"/>
-              <w:right w:type="dxa" w:w="80"/>
-            </w:tcMar>
-          </w:tcPr>
-          <w:p>
-            <w:pPr>
-              <w:keepNext/>
-              <w:jc w:val="center"/>
-            </w:pPr>
-            <w:r>
-              <w:rPr>
-                <w:rFonts w:ascii="Arial" w:cs="Arial" w:eastAsia="Arial" w:hAnsi="Arial"/>
-                <w:b w:val="false"/>
-                <w:bCs w:val="false"/>
-                <w:sz w:val="18"/>
-                <w:szCs w:val="18"/>
-              </w:rPr>
-              <w:t xml:space="preserve">16.08</w:t>
-            </w:r>
-          </w:p>
-        </w:tc>
-        <w:tc>
-          <w:tcPr>
-            <w:tcW w:type="dxa" w:w="1720"/>
-            <w:tcBorders>
-              <w:top w:val="single" w:color="BFBFBF" w:sz="4"/>
-              <w:left w:val="single" w:color="BFBFBF" w:sz="4"/>
-              <w:bottom w:val="single" w:color="BFBFBF" w:sz="4"/>
-              <w:right w:val="single" w:color="BFBFBF" w:sz="4"/>
-            </w:tcBorders>
-            <w:tcMar>
-              <w:top w:type="dxa" w:w="45"/>
-              <w:left w:type="dxa" w:w="80"/>
-              <w:bottom w:type="dxa" w:w="45"/>
-              <w:right w:type="dxa" w:w="80"/>
-            </w:tcMar>
-          </w:tcPr>
-          <w:p>
-            <w:pPr>
-              <w:keepNext/>
-              <w:jc w:val="center"/>
-            </w:pPr>
-            <w:r>
-              <w:rPr>
-                <w:rFonts w:ascii="Arial" w:cs="Arial" w:eastAsia="Arial" w:hAnsi="Arial"/>
-                <w:b w:val="false"/>
-                <w:bCs w:val="false"/>
-                <w:sz w:val="18"/>
-                <w:szCs w:val="18"/>
-              </w:rPr>
-              <w:t xml:space="preserve">13.19</w:t>
-            </w:r>
-          </w:p>
-        </w:tc>
-        <w:tc>
-          <w:tcPr>
-            <w:tcW w:type="dxa" w:w="1720"/>
-            <w:tcBorders>
-              <w:top w:val="single" w:color="BFBFBF" w:sz="4"/>
-              <w:left w:val="single" w:color="BFBFBF" w:sz="4"/>
-              <w:bottom w:val="single" w:color="BFBFBF" w:sz="4"/>
-              <w:right w:val="single" w:color="BFBFBF" w:sz="4"/>
-            </w:tcBorders>
-            <w:tcMar>
-              <w:top w:type="dxa" w:w="45"/>
-              <w:left w:type="dxa" w:w="80"/>
-              <w:bottom w:type="dxa" w:w="45"/>
-              <w:right w:type="dxa" w:w="80"/>
-            </w:tcMar>
-          </w:tcPr>
-          <w:p>
-            <w:pPr>
-              <w:keepNext/>
-              <w:jc w:val="center"/>
-            </w:pPr>
-            <w:r>
-              <w:rPr>
-                <w:rFonts w:ascii="Arial" w:cs="Arial" w:eastAsia="Arial" w:hAnsi="Arial"/>
-                <w:b w:val="false"/>
-                <w:bCs w:val="false"/>
-                <w:sz w:val="18"/>
-                <w:szCs w:val="18"/>
-              </w:rPr>
-              <w:t xml:space="preserve">14.71</w:t>
+              <w:t xml:space="preserve">Probabilidad de llegar con vida a los 65 años</w:t>
+            </w:r>
+          </w:p>
+        </w:tc>
+        <w:tc>
+          <w:tcPr>
+            <w:tcW w:type="dxa" w:w="3000"/>
+            <w:tcBorders>
+              <w:top w:val="single" w:color="BFBFBF" w:sz="4"/>
+              <w:left w:val="single" w:color="BFBFBF" w:sz="4"/>
+              <w:bottom w:val="single" w:color="BFBFBF" w:sz="4"/>
+              <w:right w:val="single" w:color="BFBFBF" w:sz="4"/>
+            </w:tcBorders>
+            <w:tcMar>
+              <w:top w:type="dxa" w:w="45"/>
+              <w:left w:type="dxa" w:w="80"/>
+              <w:bottom w:type="dxa" w:w="45"/>
+              <w:right w:type="dxa" w:w="80"/>
+            </w:tcMar>
+          </w:tcPr>
+          <w:p>
+            <w:pPr>
+              <w:keepNext/>
+              <w:jc w:val="center"/>
+            </w:pPr>
+            <w:r>
+              <w:rPr>
+                <w:rFonts w:ascii="Arial" w:cs="Arial" w:eastAsia="Arial" w:hAnsi="Arial"/>
+                <w:b w:val="false"/>
+                <w:bCs w:val="false"/>
+                <w:sz w:val="18"/>
+                <w:szCs w:val="18"/>
+              </w:rPr>
+              <w:t xml:space="preserve">79.4 %</w:t>
             </w:r>
           </w:p>
         </w:tc>
@@ -990,7 +792,7 @@
       <w:tr>
         <w:tc>
           <w:tcPr>
-            <w:tcW w:type="dxa" w:w="4200"/>
+            <w:tcW w:type="dxa" w:w="6360"/>
             <w:tcBorders>
               <w:top w:val="single" w:color="BFBFBF" w:sz="4"/>
               <w:left w:val="single" w:color="BFBFBF" w:sz="4"/>
@@ -1017,106 +819,40 @@
                 <w:sz w:val="18"/>
                 <w:szCs w:val="18"/>
               </w:rPr>
-              <w:t xml:space="preserve">Llegar con vida a los 65 años</w:t>
-            </w:r>
-          </w:p>
-        </w:tc>
-        <w:tc>
-          <w:tcPr>
-            <w:tcW w:type="dxa" w:w="1720"/>
-            <w:tcBorders>
-              <w:top w:val="single" w:color="BFBFBF" w:sz="4"/>
-              <w:left w:val="single" w:color="BFBFBF" w:sz="4"/>
-              <w:bottom w:val="single" w:color="BFBFBF" w:sz="4"/>
-              <w:right w:val="single" w:color="BFBFBF" w:sz="4"/>
-            </w:tcBorders>
-            <w:tcMar>
-              <w:top w:type="dxa" w:w="45"/>
-              <w:left w:type="dxa" w:w="80"/>
-              <w:bottom w:type="dxa" w:w="45"/>
-              <w:right w:type="dxa" w:w="80"/>
-            </w:tcMar>
-          </w:tcPr>
-          <w:p>
-            <w:pPr>
-              <w:keepNext/>
-              <w:jc w:val="center"/>
-            </w:pPr>
-            <w:r>
-              <w:rPr>
-                <w:rFonts w:ascii="Arial" w:cs="Arial" w:eastAsia="Arial" w:hAnsi="Arial"/>
-                <w:b w:val="false"/>
-                <w:bCs w:val="false"/>
-                <w:sz w:val="18"/>
-                <w:szCs w:val="18"/>
-              </w:rPr>
-              <w:t xml:space="preserve">73.6%</w:t>
-            </w:r>
-          </w:p>
-        </w:tc>
-        <w:tc>
-          <w:tcPr>
-            <w:tcW w:type="dxa" w:w="1720"/>
-            <w:tcBorders>
-              <w:top w:val="single" w:color="BFBFBF" w:sz="4"/>
-              <w:left w:val="single" w:color="BFBFBF" w:sz="4"/>
-              <w:bottom w:val="single" w:color="BFBFBF" w:sz="4"/>
-              <w:right w:val="single" w:color="BFBFBF" w:sz="4"/>
-            </w:tcBorders>
-            <w:tcMar>
-              <w:top w:type="dxa" w:w="45"/>
-              <w:left w:type="dxa" w:w="80"/>
-              <w:bottom w:type="dxa" w:w="45"/>
-              <w:right w:type="dxa" w:w="80"/>
-            </w:tcMar>
-          </w:tcPr>
-          <w:p>
-            <w:pPr>
-              <w:keepNext/>
-              <w:jc w:val="center"/>
-            </w:pPr>
-            <w:r>
-              <w:rPr>
-                <w:rFonts w:ascii="Arial" w:cs="Arial" w:eastAsia="Arial" w:hAnsi="Arial"/>
-                <w:b w:val="false"/>
-                <w:bCs w:val="false"/>
-                <w:sz w:val="18"/>
-                <w:szCs w:val="18"/>
-              </w:rPr>
-              <w:t xml:space="preserve">85.2%</w:t>
-            </w:r>
-          </w:p>
-        </w:tc>
-        <w:tc>
-          <w:tcPr>
-            <w:tcW w:type="dxa" w:w="1720"/>
-            <w:tcBorders>
-              <w:top w:val="single" w:color="BFBFBF" w:sz="4"/>
-              <w:left w:val="single" w:color="BFBFBF" w:sz="4"/>
-              <w:bottom w:val="single" w:color="BFBFBF" w:sz="4"/>
-              <w:right w:val="single" w:color="BFBFBF" w:sz="4"/>
-            </w:tcBorders>
-            <w:tcMar>
-              <w:top w:type="dxa" w:w="45"/>
-              <w:left w:type="dxa" w:w="80"/>
-              <w:bottom w:type="dxa" w:w="45"/>
-              <w:right w:type="dxa" w:w="80"/>
-            </w:tcMar>
-          </w:tcPr>
-          <w:p>
-            <w:pPr>
-              <w:keepNext/>
-              <w:jc w:val="center"/>
-            </w:pPr>
-            <w:r>
-              <w:rPr>
-                <w:rFonts w:ascii="Arial" w:cs="Arial" w:eastAsia="Arial" w:hAnsi="Arial"/>
-                <w:b w:val="false"/>
-                <w:bCs w:val="false"/>
-                <w:sz w:val="18"/>
-                <w:szCs w:val="18"/>
-              </w:rPr>
-              <w:t xml:space="preserve">79.4%</w:t>
+              <w:t xml:space="preserve">Probabilidad de llegar con vida a los 80 años</w:t>
+            </w:r>
+          </w:p>
+        </w:tc>
+        <w:tc>
+          <w:tcPr>
+            <w:tcW w:type="dxa" w:w="3000"/>
+            <w:tcBorders>
+              <w:top w:val="single" w:color="BFBFBF" w:sz="4"/>
+              <w:left w:val="single" w:color="BFBFBF" w:sz="4"/>
+              <w:bottom w:val="single" w:color="BFBFBF" w:sz="4"/>
+              <w:right w:val="single" w:color="BFBFBF" w:sz="4"/>
+            </w:tcBorders>
+            <w:tcMar>
+              <w:top w:type="dxa" w:w="45"/>
+              <w:left w:type="dxa" w:w="80"/>
+              <w:bottom w:type="dxa" w:w="45"/>
+              <w:right w:type="dxa" w:w="80"/>
+            </w:tcMar>
+          </w:tcPr>
+          <w:p>
+            <w:pPr>
+              <w:keepNext/>
+              <w:jc w:val="center"/>
+            </w:pPr>
+            <w:r>
+              <w:rPr>
+                <w:rFonts w:ascii="Arial" w:cs="Arial" w:eastAsia="Arial" w:hAnsi="Arial"/>
+                <w:b w:val="false"/>
+                <w:bCs w:val="false"/>
+                <w:sz w:val="18"/>
+                <w:szCs w:val="18"/>
+              </w:rPr>
+              <w:t xml:space="preserve">51.6 %</w:t>
             </w:r>
           </w:p>
         </w:tc>
@@ -1124,7 +860,7 @@
       <w:tr>
         <w:tc>
           <w:tcPr>
-            <w:tcW w:type="dxa" w:w="4200"/>
+            <w:tcW w:type="dxa" w:w="6360"/>
             <w:tcBorders>
               <w:top w:val="single" w:color="BFBFBF" w:sz="4"/>
               <w:left w:val="single" w:color="BFBFBF" w:sz="4"/>
@@ -1151,213 +887,13 @@
                 <w:sz w:val="18"/>
                 <w:szCs w:val="18"/>
               </w:rPr>
-              <w:t xml:space="preserve">Llegar con vida a los 80 años</w:t>
-            </w:r>
-          </w:p>
-        </w:tc>
-        <w:tc>
-          <w:tcPr>
-            <w:tcW w:type="dxa" w:w="1720"/>
-            <w:tcBorders>
-              <w:top w:val="single" w:color="BFBFBF" w:sz="4"/>
-              <w:left w:val="single" w:color="BFBFBF" w:sz="4"/>
-              <w:bottom w:val="single" w:color="BFBFBF" w:sz="4"/>
-              <w:right w:val="single" w:color="BFBFBF" w:sz="4"/>
-            </w:tcBorders>
-            <w:tcMar>
-              <w:top w:type="dxa" w:w="45"/>
-              <w:left w:type="dxa" w:w="80"/>
-              <w:bottom w:type="dxa" w:w="45"/>
-              <w:right w:type="dxa" w:w="80"/>
-            </w:tcMar>
-          </w:tcPr>
-          <w:p>
-            <w:pPr>
-              <w:keepNext/>
-              <w:jc w:val="center"/>
-            </w:pPr>
-            <w:r>
-              <w:rPr>
-                <w:rFonts w:ascii="Arial" w:cs="Arial" w:eastAsia="Arial" w:hAnsi="Arial"/>
-                <w:b w:val="false"/>
-                <w:bCs w:val="false"/>
-                <w:sz w:val="18"/>
-                <w:szCs w:val="18"/>
-              </w:rPr>
-              <w:t xml:space="preserve">44.8%</w:t>
-            </w:r>
-          </w:p>
-        </w:tc>
-        <w:tc>
-          <w:tcPr>
-            <w:tcW w:type="dxa" w:w="1720"/>
-            <w:tcBorders>
-              <w:top w:val="single" w:color="BFBFBF" w:sz="4"/>
-              <w:left w:val="single" w:color="BFBFBF" w:sz="4"/>
-              <w:bottom w:val="single" w:color="BFBFBF" w:sz="4"/>
-              <w:right w:val="single" w:color="BFBFBF" w:sz="4"/>
-            </w:tcBorders>
-            <w:tcMar>
-              <w:top w:type="dxa" w:w="45"/>
-              <w:left w:type="dxa" w:w="80"/>
-              <w:bottom w:type="dxa" w:w="45"/>
-              <w:right w:type="dxa" w:w="80"/>
-            </w:tcMar>
-          </w:tcPr>
-          <w:p>
-            <w:pPr>
-              <w:keepNext/>
-              <w:jc w:val="center"/>
-            </w:pPr>
-            <w:r>
-              <w:rPr>
-                <w:rFonts w:ascii="Arial" w:cs="Arial" w:eastAsia="Arial" w:hAnsi="Arial"/>
-                <w:b w:val="false"/>
-                <w:bCs w:val="false"/>
-                <w:sz w:val="18"/>
-                <w:szCs w:val="18"/>
-              </w:rPr>
-              <w:t xml:space="preserve">58.7%</w:t>
-            </w:r>
-          </w:p>
-        </w:tc>
-        <w:tc>
-          <w:tcPr>
-            <w:tcW w:type="dxa" w:w="1720"/>
-            <w:tcBorders>
-              <w:top w:val="single" w:color="BFBFBF" w:sz="4"/>
-              <w:left w:val="single" w:color="BFBFBF" w:sz="4"/>
-              <w:bottom w:val="single" w:color="BFBFBF" w:sz="4"/>
-              <w:right w:val="single" w:color="BFBFBF" w:sz="4"/>
-            </w:tcBorders>
-            <w:tcMar>
-              <w:top w:type="dxa" w:w="45"/>
-              <w:left w:type="dxa" w:w="80"/>
-              <w:bottom w:type="dxa" w:w="45"/>
-              <w:right w:type="dxa" w:w="80"/>
-            </w:tcMar>
-          </w:tcPr>
-          <w:p>
-            <w:pPr>
-              <w:keepNext/>
-              <w:jc w:val="center"/>
-            </w:pPr>
-            <w:r>
-              <w:rPr>
-                <w:rFonts w:ascii="Arial" w:cs="Arial" w:eastAsia="Arial" w:hAnsi="Arial"/>
-                <w:b w:val="false"/>
-                <w:bCs w:val="false"/>
-                <w:sz w:val="18"/>
-                <w:szCs w:val="18"/>
-              </w:rPr>
-              <w:t xml:space="preserve">51.6%</w:t>
-            </w:r>
-          </w:p>
-        </w:tc>
-      </w:tr>
-      <w:tr>
-        <w:tc>
-          <w:tcPr>
-            <w:tcW w:type="dxa" w:w="4200"/>
-            <w:tcBorders>
-              <w:top w:val="single" w:color="BFBFBF" w:sz="4"/>
-              <w:left w:val="single" w:color="BFBFBF" w:sz="4"/>
-              <w:bottom w:val="single" w:color="BFBFBF" w:sz="4"/>
-              <w:right w:val="single" w:color="BFBFBF" w:sz="4"/>
-            </w:tcBorders>
-            <w:tcMar>
-              <w:top w:type="dxa" w:w="45"/>
-              <w:left w:type="dxa" w:w="80"/>
-              <w:bottom w:type="dxa" w:w="45"/>
-              <w:right w:type="dxa" w:w="80"/>
-            </w:tcMar>
-          </w:tcPr>
-          <w:p>
-            <w:pPr>
-              <w:keepNext/>
-              <w:jc w:val="left"/>
-            </w:pPr>
-            <w:r>
-              <w:rPr>
-                <w:rFonts w:ascii="Arial" w:cs="Arial" w:eastAsia="Arial" w:hAnsi="Arial"/>
-                <w:b/>
-                <w:bCs/>
-                <w:sz w:val="18"/>
-                <w:szCs w:val="18"/>
-              </w:rPr>
-              <w:t xml:space="preserve">Edad mediana a la muerte (años)</w:t>
-            </w:r>
-          </w:p>
-        </w:tc>
-        <w:tc>
-          <w:tcPr>
-            <w:tcW w:type="dxa" w:w="1720"/>
-            <w:tcBorders>
-              <w:top w:val="single" w:color="BFBFBF" w:sz="4"/>
-              <w:left w:val="single" w:color="BFBFBF" w:sz="4"/>
-              <w:bottom w:val="single" w:color="BFBFBF" w:sz="4"/>
-              <w:right w:val="single" w:color="BFBFBF" w:sz="4"/>
-            </w:tcBorders>
-            <w:tcMar>
-              <w:top w:type="dxa" w:w="45"/>
-              <w:left w:type="dxa" w:w="80"/>
-              <w:bottom w:type="dxa" w:w="45"/>
-              <w:right w:type="dxa" w:w="80"/>
-            </w:tcMar>
-          </w:tcPr>
-          <w:p>
-            <w:pPr>
-              <w:keepNext/>
-              <w:jc w:val="center"/>
-            </w:pPr>
-            <w:r>
-              <w:rPr>
-                <w:rFonts w:ascii="Arial" w:cs="Arial" w:eastAsia="Arial" w:hAnsi="Arial"/>
-                <w:b w:val="false"/>
-                <w:bCs w:val="false"/>
-                <w:sz w:val="18"/>
-                <w:szCs w:val="18"/>
-              </w:rPr>
-              <w:t xml:space="preserve">77</w:t>
-            </w:r>
-          </w:p>
-        </w:tc>
-        <w:tc>
-          <w:tcPr>
-            <w:tcW w:type="dxa" w:w="1720"/>
-            <w:tcBorders>
-              <w:top w:val="single" w:color="BFBFBF" w:sz="4"/>
-              <w:left w:val="single" w:color="BFBFBF" w:sz="4"/>
-              <w:bottom w:val="single" w:color="BFBFBF" w:sz="4"/>
-              <w:right w:val="single" w:color="BFBFBF" w:sz="4"/>
-            </w:tcBorders>
-            <w:tcMar>
-              <w:top w:type="dxa" w:w="45"/>
-              <w:left w:type="dxa" w:w="80"/>
-              <w:bottom w:type="dxa" w:w="45"/>
-              <w:right w:type="dxa" w:w="80"/>
-            </w:tcMar>
-          </w:tcPr>
-          <w:p>
-            <w:pPr>
-              <w:keepNext/>
-              <w:jc w:val="center"/>
-            </w:pPr>
-            <w:r>
-              <w:rPr>
-                <w:rFonts w:ascii="Arial" w:cs="Arial" w:eastAsia="Arial" w:hAnsi="Arial"/>
-                <w:b w:val="false"/>
-                <w:bCs w:val="false"/>
-                <w:sz w:val="18"/>
-                <w:szCs w:val="18"/>
-              </w:rPr>
-              <w:t xml:space="preserve">82</w:t>
-            </w:r>
-          </w:p>
-        </w:tc>
-        <w:tc>
-          <w:tcPr>
-            <w:tcW w:type="dxa" w:w="1720"/>
+              <w:t xml:space="preserve">Edad hasta la que sobrevive al menos la mitad (años cumplidos)</w:t>
+            </w:r>
+          </w:p>
+        </w:tc>
+        <w:tc>
+          <w:tcPr>
+            <w:tcW w:type="dxa" w:w="3000"/>
             <w:tcBorders>
               <w:top w:val="single" w:color="BFBFBF" w:sz="4"/>
               <w:left w:val="single" w:color="BFBFBF" w:sz="4"/>
@@ -1414,7 +950,7 @@
           <w:sz w:val="21"/>
           <w:szCs w:val="21"/>
         </w:rPr>
-        <w:t xml:space="preserve">Extracto de la tabla de mortalidad, ambos sexos (la tabla completa de 0 a 100 años, y las de hombres y mujeres, están en el Excel):</w:t>
+        <w:t xml:space="preserve">Extracto de la tabla (la tabla completa de 0 a 100 años está en el Excel):</w:t>
       </w:r>
     </w:p>
     <w:tbl>
@@ -1876,7 +1412,7 @@
                 <w:sz w:val="18"/>
                 <w:szCs w:val="18"/>
               </w:rPr>
-              <w:t xml:space="preserve">7,598,804</w:t>
+              <w:t xml:space="preserve">7,598,754</w:t>
             </w:r>
           </w:p>
         </w:tc>
@@ -2076,7 +1612,7 @@
                 <w:sz w:val="18"/>
                 <w:szCs w:val="18"/>
               </w:rPr>
-              <w:t xml:space="preserve">98,702</w:t>
+              <w:t xml:space="preserve">98,703</w:t>
             </w:r>
           </w:p>
         </w:tc>
@@ -2109,7 +1645,7 @@
                 <w:sz w:val="18"/>
                 <w:szCs w:val="18"/>
               </w:rPr>
-              <w:t xml:space="preserve">7,499,425</w:t>
+              <w:t xml:space="preserve">7,499,375</w:t>
             </w:r>
           </w:p>
         </w:tc>
@@ -2243,7 +1779,7 @@
                 <w:sz w:val="18"/>
                 <w:szCs w:val="18"/>
               </w:rPr>
-              <w:t xml:space="preserve">98,529</w:t>
+              <w:t xml:space="preserve">98,528</w:t>
             </w:r>
           </w:p>
         </w:tc>
@@ -2342,7 +1878,7 @@
                 <w:sz w:val="18"/>
                 <w:szCs w:val="18"/>
               </w:rPr>
-              <w:t xml:space="preserve">7,104,985</w:t>
+              <w:t xml:space="preserve">7,104,934</w:t>
             </w:r>
           </w:p>
         </w:tc>
@@ -2476,7 +2012,7 @@
                 <w:sz w:val="18"/>
                 <w:szCs w:val="18"/>
               </w:rPr>
-              <w:t xml:space="preserve">98,415</w:t>
+              <w:t xml:space="preserve">98,414</w:t>
             </w:r>
           </w:p>
         </w:tc>
@@ -2575,7 +2111,7 @@
                 <w:sz w:val="18"/>
                 <w:szCs w:val="18"/>
               </w:rPr>
-              <w:t xml:space="preserve">6,612,632</w:t>
+              <w:t xml:space="preserve">6,612,582</w:t>
             </w:r>
           </w:p>
         </w:tc>
@@ -2808,7 +2344,7 @@
                 <w:sz w:val="18"/>
                 <w:szCs w:val="18"/>
               </w:rPr>
-              <w:t xml:space="preserve">5,630,488</w:t>
+              <w:t xml:space="preserve">5,630,439</w:t>
             </w:r>
           </w:p>
         </w:tc>
@@ -2942,7 +2478,7 @@
                 <w:sz w:val="18"/>
                 <w:szCs w:val="18"/>
               </w:rPr>
-              <w:t xml:space="preserve">96,283</w:t>
+              <w:t xml:space="preserve">96,282</w:t>
             </w:r>
           </w:p>
         </w:tc>
@@ -3008,7 +2544,7 @@
                 <w:sz w:val="18"/>
                 <w:szCs w:val="18"/>
               </w:rPr>
-              <w:t xml:space="preserve">96,193</w:t>
+              <w:t xml:space="preserve">96,192</w:t>
             </w:r>
           </w:p>
         </w:tc>
@@ -3041,7 +2577,7 @@
                 <w:sz w:val="18"/>
                 <w:szCs w:val="18"/>
               </w:rPr>
-              <w:t xml:space="preserve">4,659,290</w:t>
+              <w:t xml:space="preserve">4,659,246</w:t>
             </w:r>
           </w:p>
         </w:tc>
@@ -3175,7 +2711,7 @@
                 <w:sz w:val="18"/>
                 <w:szCs w:val="18"/>
               </w:rPr>
-              <w:t xml:space="preserve">94,212</w:t>
+              <w:t xml:space="preserve">94,210</w:t>
             </w:r>
           </w:p>
         </w:tc>
@@ -3241,7 +2777,7 @@
                 <w:sz w:val="18"/>
                 <w:szCs w:val="18"/>
               </w:rPr>
-              <w:t xml:space="preserve">94,090</w:t>
+              <w:t xml:space="preserve">94,088</w:t>
             </w:r>
           </w:p>
         </w:tc>
@@ -3274,7 +2810,7 @@
                 <w:sz w:val="18"/>
                 <w:szCs w:val="18"/>
               </w:rPr>
-              <w:t xml:space="preserve">3,706,303</w:t>
+              <w:t xml:space="preserve">3,706,268</w:t>
             </w:r>
           </w:p>
         </w:tc>
@@ -3408,7 +2944,7 @@
                 <w:sz w:val="18"/>
                 <w:szCs w:val="18"/>
               </w:rPr>
-              <w:t xml:space="preserve">90,856</w:t>
+              <w:t xml:space="preserve">90,854</w:t>
             </w:r>
           </w:p>
         </w:tc>
@@ -3474,7 +3010,7 @@
                 <w:sz w:val="18"/>
                 <w:szCs w:val="18"/>
               </w:rPr>
-              <w:t xml:space="preserve">90,634</w:t>
+              <w:t xml:space="preserve">90,633</w:t>
             </w:r>
           </w:p>
         </w:tc>
@@ -3507,7 +3043,7 @@
                 <w:sz w:val="18"/>
                 <w:szCs w:val="18"/>
               </w:rPr>
-              <w:t xml:space="preserve">2,779,305</w:t>
+              <w:t xml:space="preserve">2,779,287</w:t>
             </w:r>
           </w:p>
         </w:tc>
@@ -3641,7 +3177,7 @@
                 <w:sz w:val="18"/>
                 <w:szCs w:val="18"/>
               </w:rPr>
-              <w:t xml:space="preserve">84,518</w:t>
+              <w:t xml:space="preserve">84,517</w:t>
             </w:r>
           </w:p>
         </w:tc>
@@ -3707,7 +3243,7 @@
                 <w:sz w:val="18"/>
                 <w:szCs w:val="18"/>
               </w:rPr>
-              <w:t xml:space="preserve">84,066</w:t>
+              <w:t xml:space="preserve">84,065</w:t>
             </w:r>
           </w:p>
         </w:tc>
@@ -3740,7 +3276,7 @@
                 <w:sz w:val="18"/>
                 <w:szCs w:val="18"/>
               </w:rPr>
-              <w:t xml:space="preserve">1,898,566</w:t>
+              <w:t xml:space="preserve">1,898,558</w:t>
             </w:r>
           </w:p>
         </w:tc>
@@ -3874,7 +3410,7 @@
                 <w:sz w:val="18"/>
                 <w:szCs w:val="18"/>
               </w:rPr>
-              <w:t xml:space="preserve">79,416</w:t>
+              <w:t xml:space="preserve">79,415</w:t>
             </w:r>
           </w:p>
         </w:tc>
@@ -3940,7 +3476,7 @@
                 <w:sz w:val="18"/>
                 <w:szCs w:val="18"/>
               </w:rPr>
-              <w:t xml:space="preserve">78,814</w:t>
+              <w:t xml:space="preserve">78,813</w:t>
             </w:r>
           </w:p>
         </w:tc>
@@ -3973,7 +3509,7 @@
                 <w:sz w:val="18"/>
                 <w:szCs w:val="18"/>
               </w:rPr>
-              <w:t xml:space="preserve">1,488,147</w:t>
+              <w:t xml:space="preserve">1,488,142</w:t>
             </w:r>
           </w:p>
         </w:tc>
@@ -4107,7 +3643,7 @@
                 <w:sz w:val="18"/>
                 <w:szCs w:val="18"/>
               </w:rPr>
-              <w:t xml:space="preserve">72,614</w:t>
+              <w:t xml:space="preserve">72,613</w:t>
             </w:r>
           </w:p>
         </w:tc>
@@ -4206,7 +3742,7 @@
                 <w:sz w:val="18"/>
                 <w:szCs w:val="18"/>
               </w:rPr>
-              <w:t xml:space="preserve">1,107,181</w:t>
+              <w:t xml:space="preserve">1,107,180</w:t>
             </w:r>
           </w:p>
         </w:tc>
@@ -4439,7 +3975,7 @@
                 <w:sz w:val="18"/>
                 <w:szCs w:val="18"/>
               </w:rPr>
-              <w:t xml:space="preserve">476,635</w:t>
+              <w:t xml:space="preserve">476,640</w:t>
             </w:r>
           </w:p>
         </w:tc>
@@ -4672,7 +4208,7 @@
                 <w:sz w:val="18"/>
                 <w:szCs w:val="18"/>
               </w:rPr>
-              <w:t xml:space="preserve">107,737</w:t>
+              <w:t xml:space="preserve">107,740</w:t>
             </w:r>
           </w:p>
         </w:tc>
@@ -4872,7 +4408,7 @@
                 <w:sz w:val="18"/>
                 <w:szCs w:val="18"/>
               </w:rPr>
-              <w:t xml:space="preserve">3,935</w:t>
+              <w:t xml:space="preserve">3,936</w:t>
             </w:r>
           </w:p>
         </w:tc>
@@ -4905,7 +4441,7 @@
                 <w:sz w:val="18"/>
                 <w:szCs w:val="18"/>
               </w:rPr>
-              <w:t xml:space="preserve">5,703</w:t>
+              <w:t xml:space="preserve">5,704</w:t>
             </w:r>
           </w:p>
         </w:tc>
@@ -5201,7 +4737,7 @@
           <wp:inline distT="0" distB="0" distL="0" distR="0">
             <wp:extent cx="4476750" cy="2486025"/>
             <wp:effectExtent t="0" r="0" b="0" l="0"/>
-            <wp:docPr id="1" name="lx_sobrevivientes.png" descr="Figura 1. Sobrevivientes lx de 100,000 nacidos, por sexo." title="lx_sobrevivientes.png"/>
+            <wp:docPr id="1" name="lx_sobrevivientes.png" descr="Figura 1. Sobrevivientes lx de una generación ficticia de 100,000 nacidos." title="lx_sobrevivientes.png"/>
             <wp:cNvGraphicFramePr>
               <a:graphicFrameLocks xmlns:a="http://schemas.openxmlformats.org/drawingml/2006/main" noChangeAspect="1"/>
             </wp:cNvGraphicFramePr>
@@ -5251,7 +4787,7 @@
           <w:sz w:val="17"/>
           <w:szCs w:val="17"/>
         </w:rPr>
-        <w:t xml:space="preserve">Figura 1. Sobrevivientes lx de 100,000 nacidos, por sexo.</w:t>
+        <w:t xml:space="preserve">Figura 1. Sobrevivientes lx de una generación ficticia de 100,000 nacidos.</w:t>
       </w:r>
     </w:p>
     <w:p>
@@ -5320,119 +4856,6 @@
     </w:p>
     <w:p>
       <w:pPr>
-        <w:pStyle w:val="Heading1"/>
-        <w:spacing w:after="110" w:before="260"/>
-      </w:pPr>
-      <w:r>
-        <w:rPr>
-          <w:rFonts w:ascii="Arial" w:cs="Arial" w:eastAsia="Arial" w:hAnsi="Arial"/>
-          <w:b/>
-          <w:bCs/>
-          <w:color w:val="1F3864"/>
-          <w:sz w:val="25"/>
-          <w:szCs w:val="25"/>
-        </w:rPr>
-        <w:t xml:space="preserve">4. Análisis</w:t>
-      </w:r>
-    </w:p>
-    <w:p>
-      <w:pPr>
-        <w:keepLines/>
-        <w:spacing w:after="120" w:line="276"/>
-      </w:pPr>
-      <w:r>
-        <w:rPr>
-          <w:rFonts w:ascii="Arial" w:cs="Arial" w:eastAsia="Arial" w:hAnsi="Arial"/>
-          <w:b/>
-          <w:bCs/>
-          <w:sz w:val="21"/>
-          <w:szCs w:val="21"/>
-        </w:rPr>
-        <w:t xml:space="preserve">1. Resultado principal. </w:t>
-      </w:r>
-      <w:r>
-        <w:rPr>
-          <w:rFonts w:ascii="Arial" w:cs="Arial" w:eastAsia="Arial" w:hAnsi="Arial"/>
-          <w:sz w:val="21"/>
-          <w:szCs w:val="21"/>
-        </w:rPr>
-        <w:t xml:space="preserve">Con las defunciones y nacimientos de INEGI de 2019 y la población del Censo 2020, la esperanza de vida al nacer en México es de 76.0 años (hombres 72.9; mujeres 79.1). Las mujeres viven en promedio 6.2 años más. De cada 100,000 nacidos vivos, 79,416 llegan a los 65 años y 51,635 a los 80; la mitad ya murió a los 80 años (hombres 77; mujeres 82).</w:t>
-      </w:r>
-    </w:p>
-    <w:p>
-      <w:pPr>
-        <w:keepLines/>
-        <w:spacing w:after="120" w:line="276"/>
-      </w:pPr>
-      <w:r>
-        <w:rPr>
-          <w:rFonts w:ascii="Arial" w:cs="Arial" w:eastAsia="Arial" w:hAnsi="Arial"/>
-          <w:b/>
-          <w:bCs/>
-          <w:sz w:val="21"/>
-          <w:szCs w:val="21"/>
-        </w:rPr>
-        <w:t xml:space="preserve">2. Forma de la mortalidad por edad. </w:t>
-      </w:r>
-      <w:r>
-        <w:rPr>
-          <w:rFonts w:ascii="Arial" w:cs="Arial" w:eastAsia="Arial" w:hAnsi="Arial"/>
-          <w:sz w:val="21"/>
-          <w:szCs w:val="21"/>
-        </w:rPr>
-        <w:t xml:space="preserve">La curva de qx tiene la forma clásica: alta en el primer año (q0 = 12.4 por mil), mínima entre los 8 y los 12 años (el valor más bajo ocurre a los 8 años) y creciente después, casi de forma exponencial. La esperanza de vida a los 1 año (75.9) ya no supera a la del nacimiento (76.0), señal de que la mortalidad infantil es hoy relativamente baja; la probabilidad de morir antes de los 5 años es 14.7 por mil.</w:t>
-      </w:r>
-    </w:p>
-    <w:p>
-      <w:pPr>
-        <w:keepLines/>
-        <w:spacing w:after="120" w:line="276"/>
-      </w:pPr>
-      <w:r>
-        <w:rPr>
-          <w:rFonts w:ascii="Arial" w:cs="Arial" w:eastAsia="Arial" w:hAnsi="Arial"/>
-          <w:b/>
-          <w:bCs/>
-          <w:sz w:val="21"/>
-          <w:szCs w:val="21"/>
-        </w:rPr>
-        <w:t xml:space="preserve">3. Sobremortalidad masculina. </w:t>
-      </w:r>
-      <w:r>
-        <w:rPr>
-          <w:rFonts w:ascii="Arial" w:cs="Arial" w:eastAsia="Arial" w:hAnsi="Arial"/>
-          <w:sz w:val="21"/>
-          <w:szCs w:val="21"/>
-        </w:rPr>
-        <w:t xml:space="preserve">Entre los 15 y los 39 años la probabilidad de morir de los hombres es en promedio 3.4 veces la de las mujeres, con un máximo de 4.0 veces a los 24 años: en esas edades pesan las muertes violentas y accidentales. Esa diferencia explica por qué solo 74 de cada 100 hombres llegan a los 65 años, frente a 85 de cada 100 mujeres.</w:t>
-      </w:r>
-    </w:p>
-    <w:p>
-      <w:pPr>
-        <w:keepLines/>
-        <w:spacing w:after="120" w:line="276"/>
-      </w:pPr>
-      <w:r>
-        <w:rPr>
-          <w:rFonts w:ascii="Arial" w:cs="Arial" w:eastAsia="Arial" w:hAnsi="Arial"/>
-          <w:b/>
-          <w:bCs/>
-          <w:sz w:val="21"/>
-          <w:szCs w:val="21"/>
-        </w:rPr>
-        <w:t xml:space="preserve">4. Comparación con la ONU. </w:t>
-      </w:r>
-      <w:r>
-        <w:rPr>
-          <w:rFonts w:ascii="Arial" w:cs="Arial" w:eastAsia="Arial" w:hAnsi="Arial"/>
-          <w:sz w:val="21"/>
-          <w:szCs w:val="21"/>
-        </w:rPr>
-        <w:t xml:space="preserve">La e0 con cifras registradas de INEGI (76.0) queda 1.5 años por encima de la estimación de la ONU para 2019 (74.5). Las probabilidades de morir de esta tabla son entre 6 % y 13 % menores que las de la ONU de los 20 a los 79 años y entre 19 % y 25 % menores de los 80 años en adelante (promedios por década). Es la dirección esperada si hay subregistro de defunciones y si el Censo exagera la población de edades avanzadas.</w:t>
-      </w:r>
-    </w:p>
-    <w:p>
-      <w:pPr>
         <w:keepNext/>
         <w:spacing w:after="30" w:before="100"/>
         <w:jc w:val="center"/>
@@ -5442,7 +4865,7 @@
           <wp:inline distT="0" distB="0" distL="0" distR="0">
             <wp:extent cx="4476750" cy="2486025"/>
             <wp:effectExtent t="0" r="0" b="0" l="0"/>
-            <wp:docPr id="1" name="sobremortalidad_masculina.png" descr="Figura 3. Cociente entre la probabilidad de morir de hombres y de mujeres." title="sobremortalidad_masculina.png"/>
+            <wp:docPr id="1" name="dx_defunciones.png" descr="Figura 3. Defunciones dx de la tabla, por edad." title="dx_defunciones.png"/>
             <wp:cNvGraphicFramePr>
               <a:graphicFrameLocks xmlns:a="http://schemas.openxmlformats.org/drawingml/2006/main" noChangeAspect="1"/>
             </wp:cNvGraphicFramePr>
@@ -5492,7 +4915,93 @@
           <w:sz w:val="17"/>
           <w:szCs w:val="17"/>
         </w:rPr>
-        <w:t xml:space="preserve">Figura 3. Cociente entre la probabilidad de morir de hombres y de mujeres.</w:t>
+        <w:t xml:space="preserve">Figura 3. Defunciones dx de la tabla, por edad.</w:t>
+      </w:r>
+    </w:p>
+    <w:p>
+      <w:pPr>
+        <w:pStyle w:val="Heading1"/>
+        <w:spacing w:after="110" w:before="260"/>
+      </w:pPr>
+      <w:r>
+        <w:rPr>
+          <w:rFonts w:ascii="Arial" w:cs="Arial" w:eastAsia="Arial" w:hAnsi="Arial"/>
+          <w:b/>
+          <w:bCs/>
+          <w:color w:val="1F3864"/>
+          <w:sz w:val="25"/>
+          <w:szCs w:val="25"/>
+        </w:rPr>
+        <w:t xml:space="preserve">4. Análisis</w:t>
+      </w:r>
+    </w:p>
+    <w:p>
+      <w:pPr>
+        <w:spacing w:after="120" w:line="276"/>
+      </w:pPr>
+      <w:r>
+        <w:rPr>
+          <w:rFonts w:ascii="Arial" w:cs="Arial" w:eastAsia="Arial" w:hAnsi="Arial"/>
+          <w:b/>
+          <w:bCs/>
+          <w:sz w:val="21"/>
+          <w:szCs w:val="21"/>
+        </w:rPr>
+        <w:t xml:space="preserve">Primer año de vida. </w:t>
+      </w:r>
+      <w:r>
+        <w:rPr>
+          <w:rFonts w:ascii="Arial" w:cs="Arial" w:eastAsia="Arial" w:hAnsi="Arial"/>
+          <w:sz w:val="21"/>
+          <w:szCs w:val="21"/>
+        </w:rPr>
+        <w:t xml:space="preserve">De 100,000 nacidos mueren 1,242 antes de cumplir un año (12.4 por mil), el riesgo más alto de la vida hasta los 62 años. Aun así, la esperanza de vida casi no cambia entre el nacimiento (75.99) y el primer año (75.94), señal de que la mortalidad infantil ya es relativamente baja. El riesgo cae rápido y llega a su mínimo a los 8 años (qx = 0.00020).</w:t>
+      </w:r>
+    </w:p>
+    <w:p>
+      <w:pPr>
+        <w:spacing w:after="120" w:line="276"/>
+      </w:pPr>
+      <w:r>
+        <w:rPr>
+          <w:rFonts w:ascii="Arial" w:cs="Arial" w:eastAsia="Arial" w:hAnsi="Arial"/>
+          <w:b/>
+          <w:bCs/>
+          <w:sz w:val="21"/>
+          <w:szCs w:val="21"/>
+        </w:rPr>
+        <w:t xml:space="preserve">Vida adulta. </w:t>
+      </w:r>
+      <w:r>
+        <w:rPr>
+          <w:rFonts w:ascii="Arial" w:cs="Arial" w:eastAsia="Arial" w:hAnsi="Arial"/>
+          <w:sz w:val="21"/>
+          <w:szCs w:val="21"/>
+        </w:rPr>
+        <w:t xml:space="preserve">Desde la adolescencia qx crece de forma casi exponencial: 0.0049 a los 50 años y 0.053 a los 80. Al menos la mitad de la generación sobrevive hasta los 80 años y las defunciones adultas se concentran alrededor de los 83 años (Figura 3).</w:t>
+      </w:r>
+    </w:p>
+    <w:p>
+      <w:pPr>
+        <w:spacing w:after="120" w:line="276"/>
+      </w:pPr>
+      <w:r>
+        <w:rPr>
+          <w:rFonts w:ascii="Arial" w:cs="Arial" w:eastAsia="Arial" w:hAnsi="Arial"/>
+          <w:b/>
+          <w:bCs/>
+          <w:sz w:val="21"/>
+          <w:szCs w:val="21"/>
+        </w:rPr>
+        <w:t xml:space="preserve">Diferencias por sexo. </w:t>
+      </w:r>
+      <w:r>
+        <w:rPr>
+          <w:rFonts w:ascii="Arial" w:cs="Arial" w:eastAsia="Arial" w:hAnsi="Arial"/>
+          <w:sz w:val="21"/>
+          <w:szCs w:val="21"/>
+        </w:rPr>
+        <w:t xml:space="preserve">Con las mismas fórmulas aplicadas por separado a hombres y mujeres, la e0 es 72.9 y 79.1 años: las mujeres viven 6.2 años más. Entre los 15 y los 39 años la probabilidad de morir de los hombres es en promedio 3.4 veces la de las mujeres, con un máximo de 4.0 veces a los 24 años (Figura 4): en esas edades pesan las muertes violentas y por accidentes.</w:t>
       </w:r>
     </w:p>
     <w:p>
@@ -5506,7 +5015,7 @@
           <wp:inline distT="0" distB="0" distL="0" distR="0">
             <wp:extent cx="4476750" cy="2486025"/>
             <wp:effectExtent t="0" r="0" b="0" l="0"/>
-            <wp:docPr id="1" name="e0_comparacion_onu.png" descr="Figura 4. e0 con datos de INEGI frente a la estimación de la ONU para 2019." title="e0_comparacion_onu.png"/>
+            <wp:docPr id="1" name="sobremortalidad_masculina.png" descr="Figura 4. Cociente entre la probabilidad de morir de hombres y de mujeres." title="sobremortalidad_masculina.png"/>
             <wp:cNvGraphicFramePr>
               <a:graphicFrameLocks xmlns:a="http://schemas.openxmlformats.org/drawingml/2006/main" noChangeAspect="1"/>
             </wp:cNvGraphicFramePr>
@@ -5556,7 +5065,94 @@
           <w:sz w:val="17"/>
           <w:szCs w:val="17"/>
         </w:rPr>
-        <w:t xml:space="preserve">Figura 4. e0 con datos de INEGI frente a la estimación de la ONU para 2019.</w:t>
+        <w:t xml:space="preserve">Figura 4. Cociente entre la probabilidad de morir de hombres y de mujeres.</w:t>
+      </w:r>
+    </w:p>
+    <w:p>
+      <w:pPr>
+        <w:spacing w:after="120" w:line="276"/>
+      </w:pPr>
+      <w:r>
+        <w:rPr>
+          <w:rFonts w:ascii="Arial" w:cs="Arial" w:eastAsia="Arial" w:hAnsi="Arial"/>
+          <w:b/>
+          <w:bCs/>
+          <w:sz w:val="21"/>
+          <w:szCs w:val="21"/>
+        </w:rPr>
+        <w:t xml:space="preserve">Comparación con CONAPO. </w:t>
+      </w:r>
+      <w:r>
+        <w:rPr>
+          <w:rFonts w:ascii="Arial" w:cs="Arial" w:eastAsia="Arial" w:hAnsi="Arial"/>
+          <w:sz w:val="21"/>
+          <w:szCs w:val="21"/>
+        </w:rPr>
+        <w:t xml:space="preserve">Como referencia externa (no se usa en la tabla), CONAPO estima para 2019 una e0 de 74.8 años (hombres 71.8; mujeres 78.0). La tabla con cifras de INEGI queda 1.1 años por encima (Figura 5). Es la dirección esperada si las defunciones registradas están algo subregistradas y si el Censo exagera la población de edades avanzadas, aunque con estas bases no puedo cuantificar cuánto aporta cada causa.</w:t>
+      </w:r>
+    </w:p>
+    <w:p>
+      <w:pPr>
+        <w:keepNext/>
+        <w:spacing w:after="30" w:before="100"/>
+        <w:jc w:val="center"/>
+      </w:pPr>
+      <w:r>
+        <w:drawing>
+          <wp:inline distT="0" distB="0" distL="0" distR="0">
+            <wp:extent cx="4476750" cy="2486025"/>
+            <wp:effectExtent t="0" r="0" b="0" l="0"/>
+            <wp:docPr id="1" name="e0_comparacion_conapo.png" descr="Figura 5. e0 con datos de INEGI frente a la e0 oficial de CONAPO para 2019." title="e0_comparacion_conapo.png"/>
+            <wp:cNvGraphicFramePr>
+              <a:graphicFrameLocks xmlns:a="http://schemas.openxmlformats.org/drawingml/2006/main" noChangeAspect="1"/>
+            </wp:cNvGraphicFramePr>
+            <a:graphic xmlns:a="http://schemas.openxmlformats.org/drawingml/2006/main">
+              <a:graphicData uri="http://schemas.openxmlformats.org/drawingml/2006/picture">
+                <pic:pic xmlns:pic="http://schemas.openxmlformats.org/drawingml/2006/picture">
+                  <pic:nvPicPr>
+                    <pic:cNvPr id="0" name="" descr=""/>
+                    <pic:cNvPicPr>
+                      <a:picLocks noChangeAspect="1" noChangeArrowheads="1"/>
+                    </pic:cNvPicPr>
+                  </pic:nvPicPr>
+                  <pic:blipFill>
+                    <a:blip r:embed="rId12" cstate="none"/>
+                    <a:srcRect/>
+                    <a:stretch>
+                      <a:fillRect/>
+                    </a:stretch>
+                  </pic:blipFill>
+                  <pic:spPr bwMode="auto">
+                    <a:xfrm>
+                      <a:off x="0" y="0"/>
+                      <a:ext cx="4476750" cy="2486025"/>
+                    </a:xfrm>
+                    <a:prstGeom prst="rect">
+                      <a:avLst/>
+                    </a:prstGeom>
+                  </pic:spPr>
+                </pic:pic>
+              </a:graphicData>
+            </a:graphic>
+          </wp:inline>
+        </w:drawing>
+      </w:r>
+    </w:p>
+    <w:p>
+      <w:pPr>
+        <w:spacing w:after="150"/>
+        <w:jc w:val="center"/>
+      </w:pPr>
+      <w:r>
+        <w:rPr>
+          <w:rFonts w:ascii="Arial" w:cs="Arial" w:eastAsia="Arial" w:hAnsi="Arial"/>
+          <w:i/>
+          <w:iCs/>
+          <w:color w:val="595959"/>
+          <w:sz w:val="17"/>
+          <w:szCs w:val="17"/>
+        </w:rPr>
+        <w:t xml:space="preserve">Figura 5. e0 con datos de INEGI frente a la e0 oficial de CONAPO para 2019.</w:t>
       </w:r>
     </w:p>
     <w:p>
@@ -5583,7 +5179,7 @@
           <w:ilvl w:val="0"/>
           <w:numId w:val="2"/>
         </w:numPr>
-        <w:spacing w:after="50" w:line="264"/>
+        <w:spacing w:after="60" w:line="264"/>
       </w:pPr>
       <w:r>
         <w:rPr>
@@ -5591,7 +5187,7 @@
           <w:sz w:val="21"/>
           <w:szCs w:val="21"/>
         </w:rPr>
-        <w:t xml:space="preserve">El Censo tiene atracción de edades redondas; por eso se suavizó con media móvil de 5 edades (interruptor en Leeme).</w:t>
+        <w:t xml:space="preserve">Es una tabla de periodo (generación ficticia), no el seguimiento de una generación real: con las bases de INEGI las defunciones por edad solo existen desde 1990.</w:t>
       </w:r>
     </w:p>
     <w:p>
@@ -5601,7 +5197,7 @@
           <w:ilvl w:val="0"/>
           <w:numId w:val="2"/>
         </w:numPr>
-        <w:spacing w:after="50" w:line="264"/>
+        <w:spacing w:after="60" w:line="264"/>
       </w:pPr>
       <w:r>
         <w:rPr>
@@ -5609,7 +5205,7 @@
           <w:sz w:val="21"/>
           <w:szCs w:val="21"/>
         </w:rPr>
-        <w:t xml:space="preserve">A partir de los 85-90 años la población censal está sobrestimada: qx se aplana en ~0.17-0.19 y 3.5 % de los nacidos llegaría a los 100 años, lo cual no es creíble; las esperanzas de vida a edades avanzadas son optimistas.</w:t>
+        <w:t xml:space="preserve">El Censo sobrestima la población de edades avanzadas: a partir de ~90 años qx se aplana y 3.5 % de los nacidos llegaría a los 100 años, lo cual no es creíble. Con qx = 1 en el grupo abierto, e100 = 0.5 años.</w:t>
       </w:r>
     </w:p>
     <w:p>
@@ -5619,7 +5215,7 @@
           <w:ilvl w:val="0"/>
           <w:numId w:val="2"/>
         </w:numPr>
-        <w:spacing w:after="50" w:line="264"/>
+        <w:spacing w:after="60" w:line="264"/>
       </w:pPr>
       <w:r>
         <w:rPr>
@@ -5627,7 +5223,7 @@
           <w:sz w:val="21"/>
           <w:szCs w:val="21"/>
         </w:rPr>
-        <w:t xml:space="preserve">Se usó 2019 por ser el último año completo antes de la pandemia; en 2020-2021 la mortalidad fue mucho mayor.</w:t>
+        <w:t xml:space="preserve">Las defunciones y los nacimientos son registros administrativos: pueden tener subregistro, y los nacimientos de 2019 se siguen registrando después de 2021, por lo que q(0) puede estar algo sobrestimada.</w:t>
       </w:r>
     </w:p>
     <w:p>
@@ -5637,7 +5233,7 @@
           <w:ilvl w:val="0"/>
           <w:numId w:val="2"/>
         </w:numPr>
-        <w:spacing w:after="50" w:line="264"/>
+        <w:spacing w:after="60" w:line="264"/>
       </w:pPr>
       <w:r>
         <w:rPr>
@@ -5645,7 +5241,7 @@
           <w:sz w:val="21"/>
           <w:szCs w:val="21"/>
         </w:rPr>
-        <w:t xml:space="preserve">Es una tabla de periodo (generación ficticia), no el seguimiento de una generación real.</w:t>
+        <w:t xml:space="preserve">Defunciones de 2019 y población de marzo de 2020 no son del mismo momento; la diferencia es de unos meses de crecimiento de la población.</w:t>
       </w:r>
     </w:p>
     <w:p>
@@ -5658,7 +5254,7 @@
           <w:sz w:val="21"/>
           <w:szCs w:val="21"/>
         </w:rPr>
-        <w:t xml:space="preserve">Archivos: T_Mortalidad_INEGI_Mexico_2019.xlsx (tablas con fórmulas, indicadores y gráficos) y los gráficos en PNG.</w:t>
+        <w:t xml:space="preserve">Archivos: T_Mortalidad_INEGI_Mexico_2019.xlsx (tabla de la plantilla y hojas con los datos usados), los gráficos en PNG y las bases originales de INEGI en bases_de_datos_INEGI/.</w:t>
       </w:r>
     </w:p>
     <w:sectPr>

</xml_diff>

<commit_message>
tarea_inegi: separa el Excel en libro de preparación de datos y libro de la tabla (fórmulas simples)
Co-Authored-By: Claude Sonnet 5.5 <noreply@anthropic.com>
Claude-Session: https://claude.ai/code/session_01MuUPaVKo13t4xGgqvC4yHk
</commit_message>
<xml_diff>
--- a/tarea_inegi/resultados/Analisis_Tabla_Mortalidad_INEGI_2019.docx
+++ b/tarea_inegi/resultados/Analisis_Tabla_Mortalidad_INEGI_2019.docx
@@ -259,7 +259,7 @@
           <w:sz w:val="21"/>
           <w:szCs w:val="21"/>
         </w:rPr>
-        <w:t xml:space="preserve">Dos ajustes a los datos, visibles en el Excel: (a) las defunciones con edad no especificada (0.5 %) se reparten entre las edades en proporción; (b) el Censo concentra población en edades redondas (a los 30 años hay 2.37 millones de personas y a los 31 solo 1.54 millones), lo que haría zigzaguear qx, así que de 10 a 97 años se usa una media móvil de 5 edades en defunciones y población (interruptor en la hoja de la tabla). El suavizado cambia e0 en 0.3 años. Como en la plantilla, dx y Lx se redondean a enteros.</w:t>
+        <w:t xml:space="preserve">Dos ajustes a los datos, visibles en el libro de preparación: (a) las defunciones con edad no especificada (0.5 %) se reparten entre las edades en proporción; (b) el Censo concentra población en edades redondas (a los 30 años hay 2.37 millones de personas y a los 31 solo 1.54 millones), lo que haría zigzaguear qx, así que de 10 a 97 años se usa una media móvil de 5 edades en defunciones y población (interruptor en la hoja Preparación). El suavizado cambia e0 en 0.3 años. Como en la plantilla, dx y Lx se redondean a enteros.</w:t>
       </w:r>
     </w:p>
     <w:p>
@@ -5254,7 +5254,7 @@
           <w:sz w:val="21"/>
           <w:szCs w:val="21"/>
         </w:rPr>
-        <w:t xml:space="preserve">Archivos: T_Mortalidad_INEGI_Mexico_2019.xlsx (tabla de la plantilla y hojas con los datos usados), los gráficos en PNG y las bases originales de INEGI en bases_de_datos_INEGI/.</w:t>
+        <w:t xml:space="preserve">Archivos: 2_Tabla_de_mortalidad_INEGI_2019.xlsx (tabla de la plantilla e insumos) y 1_Preparacion_datos_INEGI_2019.xlsx (datos de INEGI y su preparación), los gráficos en PNG y las bases originales de INEGI en bases_de_datos_INEGI/.</w:t>
       </w:r>
     </w:p>
     <w:sectPr>

</xml_diff>